<commit_message>
Finaliza o projeto integrado com IA'
</commit_message>
<xml_diff>
--- a/Projeto Bengala Inteligente.docx
+++ b/Projeto Bengala Inteligente.docx
@@ -1,6 +1,6 @@
 
 <file path=word/document.xml><?xml version="1.0" encoding="utf-8"?>
-<w:document xmlns:wpc="http://schemas.microsoft.com/office/word/2010/wordprocessingCanvas" xmlns:cx="http://schemas.microsoft.com/office/drawing/2014/chartex" xmlns:cx1="http://schemas.microsoft.com/office/drawing/2015/9/8/chartex" xmlns:cx2="http://schemas.microsoft.com/office/drawing/2015/10/21/chartex" xmlns:cx3="http://schemas.microsoft.com/office/drawing/2016/5/9/chartex" xmlns:cx4="http://schemas.microsoft.com/office/drawing/2016/5/10/chartex" xmlns:cx5="http://schemas.microsoft.com/office/drawing/2016/5/11/chartex" xmlns:cx6="http://schemas.microsoft.com/office/drawing/2016/5/12/chartex" xmlns:cx7="http://schemas.microsoft.com/office/drawing/2016/5/13/chartex" xmlns:cx8="http://schemas.microsoft.com/office/drawing/2016/5/14/chartex" xmlns:mc="http://schemas.openxmlformats.org/markup-compatibility/2006" xmlns:aink="http://schemas.microsoft.com/office/drawing/2016/ink" xmlns:am3d="http://schemas.microsoft.com/office/drawing/2017/model3d" xmlns:o="urn:schemas-microsoft-com:office:office" xmlns:r="http://schemas.openxmlformats.org/officeDocument/2006/relationships" xmlns:m="http://schemas.openxmlformats.org/officeDocument/2006/math" xmlns:v="urn:schemas-microsoft-com:vml" xmlns:wp14="http://schemas.microsoft.com/office/word/2010/wordprocessingDrawing" xmlns:wp="http://schemas.openxmlformats.org/drawingml/2006/wordprocessingDrawing" xmlns:w10="urn:schemas-microsoft-com:office:word" xmlns:w="http://schemas.openxmlformats.org/wordprocessingml/2006/main" xmlns:w14="http://schemas.microsoft.com/office/word/2010/wordml" xmlns:w15="http://schemas.microsoft.com/office/word/2012/wordml" xmlns:w16cid="http://schemas.microsoft.com/office/word/2016/wordml/cid" xmlns:w16se="http://schemas.microsoft.com/office/word/2015/wordml/symex" xmlns:wpg="http://schemas.microsoft.com/office/word/2010/wordprocessingGroup" xmlns:wpi="http://schemas.microsoft.com/office/word/2010/wordprocessingInk" xmlns:wne="http://schemas.microsoft.com/office/word/2006/wordml" xmlns:wps="http://schemas.microsoft.com/office/word/2010/wordprocessingShape" mc:Ignorable="w14 w15 w16se w16cid wp14">
+<w:document xmlns:wpc="http://schemas.microsoft.com/office/word/2010/wordprocessingCanvas" xmlns:cx="http://schemas.microsoft.com/office/drawing/2014/chartex" xmlns:mc="http://schemas.openxmlformats.org/markup-compatibility/2006" xmlns:o="urn:schemas-microsoft-com:office:office" xmlns:r="http://schemas.openxmlformats.org/officeDocument/2006/relationships" xmlns:m="http://schemas.openxmlformats.org/officeDocument/2006/math" xmlns:v="urn:schemas-microsoft-com:vml" xmlns:wp14="http://schemas.microsoft.com/office/word/2010/wordprocessingDrawing" xmlns:wp="http://schemas.openxmlformats.org/drawingml/2006/wordprocessingDrawing" xmlns:w10="urn:schemas-microsoft-com:office:word" xmlns:w="http://schemas.openxmlformats.org/wordprocessingml/2006/main" xmlns:w14="http://schemas.microsoft.com/office/word/2010/wordml" xmlns:w15="http://schemas.microsoft.com/office/word/2012/wordml" xmlns:w16se="http://schemas.microsoft.com/office/word/2015/wordml/symex" xmlns:wpg="http://schemas.microsoft.com/office/word/2010/wordprocessingGroup" xmlns:wpi="http://schemas.microsoft.com/office/word/2010/wordprocessingInk" xmlns:wne="http://schemas.microsoft.com/office/word/2006/wordml" xmlns:wps="http://schemas.microsoft.com/office/word/2010/wordprocessingShape" mc:Ignorable="w14 w15 w16se wp14">
   <w:body>
     <w:p>
       <w:pPr>
@@ -374,107 +374,1066 @@
         <w:t>2026</w:t>
       </w:r>
     </w:p>
-    <w:p>
-      <w:pPr>
-        <w:pStyle w:val="NormalWeb"/>
-        <w:rPr>
-          <w:rFonts w:ascii="Arial" w:hAnsi="Arial" w:cs="Arial"/>
-        </w:rPr>
-      </w:pPr>
-      <w:r>
-        <w:rPr>
-          <w:rStyle w:val="Forte"/>
-          <w:rFonts w:ascii="Arial" w:hAnsi="Arial" w:cs="Arial"/>
-        </w:rPr>
-        <w:lastRenderedPageBreak/>
-        <w:t>Descrição</w:t>
-      </w:r>
+    <w:sdt>
+      <w:sdtPr>
+        <w:id w:val="-1496878061"/>
+        <w:docPartObj>
+          <w:docPartGallery w:val="Table of Contents"/>
+          <w:docPartUnique/>
+        </w:docPartObj>
+      </w:sdtPr>
+      <w:sdtEndPr>
+        <w:rPr>
+          <w:rFonts w:asciiTheme="minorHAnsi" w:eastAsiaTheme="minorHAnsi" w:hAnsiTheme="minorHAnsi" w:cstheme="minorBidi"/>
+          <w:b/>
+          <w:bCs/>
+          <w:color w:val="auto"/>
+          <w:sz w:val="22"/>
+          <w:szCs w:val="22"/>
+          <w:lang w:eastAsia="en-US"/>
+        </w:rPr>
+      </w:sdtEndPr>
+      <w:sdtContent>
+        <w:p>
+          <w:pPr>
+            <w:pStyle w:val="CabealhodoSumrio"/>
+          </w:pPr>
+          <w:r>
+            <w:t>Sumário</w:t>
+          </w:r>
+        </w:p>
+        <w:p>
+          <w:pPr>
+            <w:pStyle w:val="Sumrio3"/>
+            <w:tabs>
+              <w:tab w:val="right" w:leader="dot" w:pos="8494"/>
+            </w:tabs>
+            <w:rPr>
+              <w:noProof/>
+            </w:rPr>
+          </w:pPr>
+          <w:r>
+            <w:fldChar w:fldCharType="begin"/>
+          </w:r>
+          <w:r>
+            <w:instrText xml:space="preserve"> TOC \o "1-3" \h \z \u </w:instrText>
+          </w:r>
+          <w:r>
+            <w:fldChar w:fldCharType="separate"/>
+          </w:r>
+          <w:hyperlink w:anchor="_Toc226959800" w:history="1">
+            <w:r>
+              <w:rPr>
+                <w:rStyle w:val="Hyperlink"/>
+                <w:rFonts w:ascii="Arial" w:eastAsia="Times New Roman" w:hAnsi="Arial" w:cs="Arial"/>
+                <w:b/>
+                <w:bCs/>
+                <w:noProof/>
+                <w:lang w:eastAsia="pt-BR"/>
+              </w:rPr>
+              <w:t>Descrição do Problema</w:t>
+            </w:r>
+            <w:r>
+              <w:rPr>
+                <w:noProof/>
+                <w:webHidden/>
+              </w:rPr>
+              <w:tab/>
+            </w:r>
+            <w:r>
+              <w:rPr>
+                <w:noProof/>
+                <w:webHidden/>
+              </w:rPr>
+              <w:fldChar w:fldCharType="begin"/>
+            </w:r>
+            <w:r>
+              <w:rPr>
+                <w:noProof/>
+                <w:webHidden/>
+              </w:rPr>
+              <w:instrText xml:space="preserve"> PAGEREF _Toc226959800 \h </w:instrText>
+            </w:r>
+            <w:r>
+              <w:rPr>
+                <w:noProof/>
+                <w:webHidden/>
+              </w:rPr>
+            </w:r>
+            <w:r>
+              <w:rPr>
+                <w:noProof/>
+                <w:webHidden/>
+              </w:rPr>
+              <w:fldChar w:fldCharType="separate"/>
+            </w:r>
+            <w:r>
+              <w:rPr>
+                <w:noProof/>
+                <w:webHidden/>
+              </w:rPr>
+              <w:t>3</w:t>
+            </w:r>
+            <w:r>
+              <w:rPr>
+                <w:noProof/>
+                <w:webHidden/>
+              </w:rPr>
+              <w:fldChar w:fldCharType="end"/>
+            </w:r>
+          </w:hyperlink>
+        </w:p>
+        <w:p>
+          <w:pPr>
+            <w:pStyle w:val="Sumrio3"/>
+            <w:tabs>
+              <w:tab w:val="right" w:leader="dot" w:pos="8494"/>
+            </w:tabs>
+            <w:rPr>
+              <w:noProof/>
+            </w:rPr>
+          </w:pPr>
+          <w:hyperlink w:anchor="_Toc226959801" w:history="1">
+            <w:r>
+              <w:rPr>
+                <w:rStyle w:val="Hyperlink"/>
+                <w:rFonts w:ascii="Arial" w:eastAsia="Times New Roman" w:hAnsi="Arial" w:cs="Arial"/>
+                <w:b/>
+                <w:bCs/>
+                <w:noProof/>
+                <w:lang w:eastAsia="pt-BR"/>
+              </w:rPr>
+              <w:t>Solução Proposta</w:t>
+            </w:r>
+            <w:r>
+              <w:rPr>
+                <w:noProof/>
+                <w:webHidden/>
+              </w:rPr>
+              <w:tab/>
+            </w:r>
+            <w:r>
+              <w:rPr>
+                <w:noProof/>
+                <w:webHidden/>
+              </w:rPr>
+              <w:fldChar w:fldCharType="begin"/>
+            </w:r>
+            <w:r>
+              <w:rPr>
+                <w:noProof/>
+                <w:webHidden/>
+              </w:rPr>
+              <w:instrText xml:space="preserve"> PAGEREF _Toc226959801 \h </w:instrText>
+            </w:r>
+            <w:r>
+              <w:rPr>
+                <w:noProof/>
+                <w:webHidden/>
+              </w:rPr>
+            </w:r>
+            <w:r>
+              <w:rPr>
+                <w:noProof/>
+                <w:webHidden/>
+              </w:rPr>
+              <w:fldChar w:fldCharType="separate"/>
+            </w:r>
+            <w:r>
+              <w:rPr>
+                <w:noProof/>
+                <w:webHidden/>
+              </w:rPr>
+              <w:t>3</w:t>
+            </w:r>
+            <w:r>
+              <w:rPr>
+                <w:noProof/>
+                <w:webHidden/>
+              </w:rPr>
+              <w:fldChar w:fldCharType="end"/>
+            </w:r>
+          </w:hyperlink>
+        </w:p>
+        <w:p>
+          <w:pPr>
+            <w:pStyle w:val="Sumrio3"/>
+            <w:tabs>
+              <w:tab w:val="right" w:leader="dot" w:pos="8494"/>
+            </w:tabs>
+            <w:rPr>
+              <w:noProof/>
+            </w:rPr>
+          </w:pPr>
+          <w:hyperlink w:anchor="_Toc226959802" w:history="1">
+            <w:r>
+              <w:rPr>
+                <w:rStyle w:val="Hyperlink"/>
+                <w:rFonts w:ascii="Arial" w:eastAsia="Times New Roman" w:hAnsi="Arial" w:cs="Arial"/>
+                <w:b/>
+                <w:bCs/>
+                <w:noProof/>
+                <w:lang w:eastAsia="pt-BR"/>
+              </w:rPr>
+              <w:t>Aplicação da Inteligência Artificial</w:t>
+            </w:r>
+            <w:r>
+              <w:rPr>
+                <w:noProof/>
+                <w:webHidden/>
+              </w:rPr>
+              <w:tab/>
+            </w:r>
+            <w:r>
+              <w:rPr>
+                <w:noProof/>
+                <w:webHidden/>
+              </w:rPr>
+              <w:fldChar w:fldCharType="begin"/>
+            </w:r>
+            <w:r>
+              <w:rPr>
+                <w:noProof/>
+                <w:webHidden/>
+              </w:rPr>
+              <w:instrText xml:space="preserve"> PAGEREF _Toc226959802 \h </w:instrText>
+            </w:r>
+            <w:r>
+              <w:rPr>
+                <w:noProof/>
+                <w:webHidden/>
+              </w:rPr>
+            </w:r>
+            <w:r>
+              <w:rPr>
+                <w:noProof/>
+                <w:webHidden/>
+              </w:rPr>
+              <w:fldChar w:fldCharType="separate"/>
+            </w:r>
+            <w:r>
+              <w:rPr>
+                <w:noProof/>
+                <w:webHidden/>
+              </w:rPr>
+              <w:t>3</w:t>
+            </w:r>
+            <w:r>
+              <w:rPr>
+                <w:noProof/>
+                <w:webHidden/>
+              </w:rPr>
+              <w:fldChar w:fldCharType="end"/>
+            </w:r>
+          </w:hyperlink>
+        </w:p>
+        <w:p>
+          <w:pPr>
+            <w:pStyle w:val="Sumrio3"/>
+            <w:tabs>
+              <w:tab w:val="right" w:leader="dot" w:pos="8494"/>
+            </w:tabs>
+            <w:rPr>
+              <w:noProof/>
+            </w:rPr>
+          </w:pPr>
+          <w:hyperlink w:anchor="_Toc226959803" w:history="1">
+            <w:r>
+              <w:rPr>
+                <w:rStyle w:val="Hyperlink"/>
+                <w:rFonts w:ascii="Arial" w:eastAsia="Times New Roman" w:hAnsi="Arial" w:cs="Arial"/>
+                <w:b/>
+                <w:bCs/>
+                <w:noProof/>
+                <w:lang w:eastAsia="pt-BR"/>
+              </w:rPr>
+              <w:t>Resultados Obtidos</w:t>
+            </w:r>
+            <w:r>
+              <w:rPr>
+                <w:noProof/>
+                <w:webHidden/>
+              </w:rPr>
+              <w:tab/>
+            </w:r>
+            <w:r>
+              <w:rPr>
+                <w:noProof/>
+                <w:webHidden/>
+              </w:rPr>
+              <w:fldChar w:fldCharType="begin"/>
+            </w:r>
+            <w:r>
+              <w:rPr>
+                <w:noProof/>
+                <w:webHidden/>
+              </w:rPr>
+              <w:instrText xml:space="preserve"> PAGEREF _Toc226959803 \h </w:instrText>
+            </w:r>
+            <w:r>
+              <w:rPr>
+                <w:noProof/>
+                <w:webHidden/>
+              </w:rPr>
+            </w:r>
+            <w:r>
+              <w:rPr>
+                <w:noProof/>
+                <w:webHidden/>
+              </w:rPr>
+              <w:fldChar w:fldCharType="separate"/>
+            </w:r>
+            <w:r>
+              <w:rPr>
+                <w:noProof/>
+                <w:webHidden/>
+              </w:rPr>
+              <w:t>4</w:t>
+            </w:r>
+            <w:r>
+              <w:rPr>
+                <w:noProof/>
+                <w:webHidden/>
+              </w:rPr>
+              <w:fldChar w:fldCharType="end"/>
+            </w:r>
+          </w:hyperlink>
+        </w:p>
+        <w:p>
+          <w:r>
+            <w:rPr>
+              <w:b/>
+              <w:bCs/>
+            </w:rPr>
+            <w:fldChar w:fldCharType="end"/>
+          </w:r>
+        </w:p>
+      </w:sdtContent>
+    </w:sdt>
+    <w:p>
+      <w:pPr>
+        <w:spacing w:before="100" w:beforeAutospacing="1" w:after="100" w:afterAutospacing="1" w:line="240" w:lineRule="auto"/>
+        <w:outlineLvl w:val="2"/>
+        <w:rPr>
+          <w:rFonts w:ascii="Arial" w:eastAsia="Times New Roman" w:hAnsi="Arial" w:cs="Arial"/>
+          <w:b/>
+          <w:bCs/>
+          <w:sz w:val="24"/>
+          <w:szCs w:val="24"/>
+          <w:lang w:eastAsia="pt-BR"/>
+        </w:rPr>
+      </w:pPr>
       <w:bookmarkStart w:id="0" w:name="_GoBack"/>
       <w:bookmarkEnd w:id="0"/>
-      <w:r>
-        <w:rPr>
-          <w:rStyle w:val="Forte"/>
-          <w:rFonts w:ascii="Arial" w:hAnsi="Arial" w:cs="Arial"/>
-        </w:rPr>
-        <w:t xml:space="preserve"> do problema</w:t>
-      </w:r>
-      <w:r>
-        <w:rPr>
-          <w:rFonts w:ascii="Arial" w:hAnsi="Arial" w:cs="Arial"/>
-        </w:rPr>
-        <w:br/>
-        <w:t>Pessoas com deficiência visual enfrentam dificuldades diárias de locomoção, mesmo com o uso da bengala tradicional. Esse dispositivo, embora eficiente para detectar obstáculos no nível do solo, possui limitações importantes, como a incapacidade de identificar objetos suspensos (galhos, placas, etc.), buracos mais profundos com antecedência ou fornecer orientação espacial detalhada. Além disso, a bengala convencional não oferece feedback inteligente nem integração com sistemas de navegação, o que reduz a autonomia e segurança do usuário.</w:t>
-      </w:r>
-    </w:p>
-    <w:p>
-      <w:pPr>
-        <w:pStyle w:val="NormalWeb"/>
-        <w:rPr>
-          <w:rFonts w:ascii="Arial" w:hAnsi="Arial" w:cs="Arial"/>
-        </w:rPr>
-      </w:pPr>
-      <w:r>
-        <w:rPr>
-          <w:rStyle w:val="Forte"/>
-          <w:rFonts w:ascii="Arial" w:hAnsi="Arial" w:cs="Arial"/>
+    </w:p>
+    <w:p>
+      <w:pPr>
+        <w:spacing w:before="100" w:beforeAutospacing="1" w:after="100" w:afterAutospacing="1" w:line="240" w:lineRule="auto"/>
+        <w:outlineLvl w:val="2"/>
+        <w:rPr>
+          <w:rFonts w:ascii="Arial" w:eastAsia="Times New Roman" w:hAnsi="Arial" w:cs="Arial"/>
+          <w:b/>
+          <w:bCs/>
+          <w:sz w:val="24"/>
+          <w:szCs w:val="24"/>
+          <w:lang w:eastAsia="pt-BR"/>
+        </w:rPr>
+      </w:pPr>
+    </w:p>
+    <w:p>
+      <w:pPr>
+        <w:spacing w:before="100" w:beforeAutospacing="1" w:after="100" w:afterAutospacing="1" w:line="240" w:lineRule="auto"/>
+        <w:outlineLvl w:val="2"/>
+        <w:rPr>
+          <w:rFonts w:ascii="Arial" w:eastAsia="Times New Roman" w:hAnsi="Arial" w:cs="Arial"/>
+          <w:b/>
+          <w:bCs/>
+          <w:sz w:val="24"/>
+          <w:szCs w:val="24"/>
+          <w:lang w:eastAsia="pt-BR"/>
+        </w:rPr>
+      </w:pPr>
+    </w:p>
+    <w:p>
+      <w:pPr>
+        <w:spacing w:before="100" w:beforeAutospacing="1" w:after="100" w:afterAutospacing="1" w:line="240" w:lineRule="auto"/>
+        <w:outlineLvl w:val="2"/>
+        <w:rPr>
+          <w:rFonts w:ascii="Arial" w:eastAsia="Times New Roman" w:hAnsi="Arial" w:cs="Arial"/>
+          <w:b/>
+          <w:bCs/>
+          <w:sz w:val="24"/>
+          <w:szCs w:val="24"/>
+          <w:lang w:eastAsia="pt-BR"/>
+        </w:rPr>
+      </w:pPr>
+    </w:p>
+    <w:p>
+      <w:pPr>
+        <w:spacing w:before="100" w:beforeAutospacing="1" w:after="100" w:afterAutospacing="1" w:line="240" w:lineRule="auto"/>
+        <w:outlineLvl w:val="2"/>
+        <w:rPr>
+          <w:rFonts w:ascii="Arial" w:eastAsia="Times New Roman" w:hAnsi="Arial" w:cs="Arial"/>
+          <w:b/>
+          <w:bCs/>
+          <w:sz w:val="24"/>
+          <w:szCs w:val="24"/>
+          <w:lang w:eastAsia="pt-BR"/>
+        </w:rPr>
+      </w:pPr>
+    </w:p>
+    <w:p>
+      <w:pPr>
+        <w:spacing w:before="100" w:beforeAutospacing="1" w:after="100" w:afterAutospacing="1" w:line="240" w:lineRule="auto"/>
+        <w:outlineLvl w:val="2"/>
+        <w:rPr>
+          <w:rFonts w:ascii="Arial" w:eastAsia="Times New Roman" w:hAnsi="Arial" w:cs="Arial"/>
+          <w:b/>
+          <w:bCs/>
+          <w:sz w:val="24"/>
+          <w:szCs w:val="24"/>
+          <w:lang w:eastAsia="pt-BR"/>
+        </w:rPr>
+      </w:pPr>
+    </w:p>
+    <w:p>
+      <w:pPr>
+        <w:spacing w:before="100" w:beforeAutospacing="1" w:after="100" w:afterAutospacing="1" w:line="240" w:lineRule="auto"/>
+        <w:outlineLvl w:val="2"/>
+        <w:rPr>
+          <w:rFonts w:ascii="Arial" w:eastAsia="Times New Roman" w:hAnsi="Arial" w:cs="Arial"/>
+          <w:b/>
+          <w:bCs/>
+          <w:sz w:val="24"/>
+          <w:szCs w:val="24"/>
+          <w:lang w:eastAsia="pt-BR"/>
+        </w:rPr>
+      </w:pPr>
+    </w:p>
+    <w:p>
+      <w:pPr>
+        <w:spacing w:before="100" w:beforeAutospacing="1" w:after="100" w:afterAutospacing="1" w:line="240" w:lineRule="auto"/>
+        <w:outlineLvl w:val="2"/>
+        <w:rPr>
+          <w:rFonts w:ascii="Arial" w:eastAsia="Times New Roman" w:hAnsi="Arial" w:cs="Arial"/>
+          <w:b/>
+          <w:bCs/>
+          <w:sz w:val="24"/>
+          <w:szCs w:val="24"/>
+          <w:lang w:eastAsia="pt-BR"/>
+        </w:rPr>
+      </w:pPr>
+    </w:p>
+    <w:p>
+      <w:pPr>
+        <w:spacing w:before="100" w:beforeAutospacing="1" w:after="100" w:afterAutospacing="1" w:line="240" w:lineRule="auto"/>
+        <w:outlineLvl w:val="2"/>
+        <w:rPr>
+          <w:rFonts w:ascii="Arial" w:eastAsia="Times New Roman" w:hAnsi="Arial" w:cs="Arial"/>
+          <w:b/>
+          <w:bCs/>
+          <w:sz w:val="24"/>
+          <w:szCs w:val="24"/>
+          <w:lang w:eastAsia="pt-BR"/>
+        </w:rPr>
+      </w:pPr>
+    </w:p>
+    <w:p>
+      <w:pPr>
+        <w:spacing w:before="100" w:beforeAutospacing="1" w:after="100" w:afterAutospacing="1" w:line="240" w:lineRule="auto"/>
+        <w:outlineLvl w:val="2"/>
+        <w:rPr>
+          <w:rFonts w:ascii="Arial" w:eastAsia="Times New Roman" w:hAnsi="Arial" w:cs="Arial"/>
+          <w:b/>
+          <w:bCs/>
+          <w:sz w:val="24"/>
+          <w:szCs w:val="24"/>
+          <w:lang w:eastAsia="pt-BR"/>
+        </w:rPr>
+      </w:pPr>
+    </w:p>
+    <w:p>
+      <w:pPr>
+        <w:spacing w:before="100" w:beforeAutospacing="1" w:after="100" w:afterAutospacing="1" w:line="240" w:lineRule="auto"/>
+        <w:outlineLvl w:val="2"/>
+        <w:rPr>
+          <w:rFonts w:ascii="Arial" w:eastAsia="Times New Roman" w:hAnsi="Arial" w:cs="Arial"/>
+          <w:b/>
+          <w:bCs/>
+          <w:sz w:val="24"/>
+          <w:szCs w:val="24"/>
+          <w:lang w:eastAsia="pt-BR"/>
+        </w:rPr>
+      </w:pPr>
+    </w:p>
+    <w:p>
+      <w:pPr>
+        <w:spacing w:before="100" w:beforeAutospacing="1" w:after="100" w:afterAutospacing="1" w:line="240" w:lineRule="auto"/>
+        <w:outlineLvl w:val="2"/>
+        <w:rPr>
+          <w:rFonts w:ascii="Arial" w:eastAsia="Times New Roman" w:hAnsi="Arial" w:cs="Arial"/>
+          <w:b/>
+          <w:bCs/>
+          <w:sz w:val="24"/>
+          <w:szCs w:val="24"/>
+          <w:lang w:eastAsia="pt-BR"/>
+        </w:rPr>
+      </w:pPr>
+    </w:p>
+    <w:p>
+      <w:pPr>
+        <w:spacing w:before="100" w:beforeAutospacing="1" w:after="100" w:afterAutospacing="1" w:line="240" w:lineRule="auto"/>
+        <w:outlineLvl w:val="2"/>
+        <w:rPr>
+          <w:rFonts w:ascii="Arial" w:eastAsia="Times New Roman" w:hAnsi="Arial" w:cs="Arial"/>
+          <w:b/>
+          <w:bCs/>
+          <w:sz w:val="24"/>
+          <w:szCs w:val="24"/>
+          <w:lang w:eastAsia="pt-BR"/>
+        </w:rPr>
+      </w:pPr>
+    </w:p>
+    <w:p>
+      <w:pPr>
+        <w:spacing w:before="100" w:beforeAutospacing="1" w:after="100" w:afterAutospacing="1" w:line="240" w:lineRule="auto"/>
+        <w:outlineLvl w:val="2"/>
+        <w:rPr>
+          <w:rFonts w:ascii="Arial" w:eastAsia="Times New Roman" w:hAnsi="Arial" w:cs="Arial"/>
+          <w:b/>
+          <w:bCs/>
+          <w:sz w:val="24"/>
+          <w:szCs w:val="24"/>
+          <w:lang w:eastAsia="pt-BR"/>
+        </w:rPr>
+      </w:pPr>
+    </w:p>
+    <w:p>
+      <w:pPr>
+        <w:spacing w:before="100" w:beforeAutospacing="1" w:after="100" w:afterAutospacing="1" w:line="240" w:lineRule="auto"/>
+        <w:outlineLvl w:val="2"/>
+        <w:rPr>
+          <w:rFonts w:ascii="Arial" w:eastAsia="Times New Roman" w:hAnsi="Arial" w:cs="Arial"/>
+          <w:b/>
+          <w:bCs/>
+          <w:sz w:val="24"/>
+          <w:szCs w:val="24"/>
+          <w:lang w:eastAsia="pt-BR"/>
+        </w:rPr>
+      </w:pPr>
+    </w:p>
+    <w:p>
+      <w:pPr>
+        <w:spacing w:before="100" w:beforeAutospacing="1" w:after="100" w:afterAutospacing="1" w:line="240" w:lineRule="auto"/>
+        <w:outlineLvl w:val="2"/>
+        <w:rPr>
+          <w:rFonts w:ascii="Arial" w:eastAsia="Times New Roman" w:hAnsi="Arial" w:cs="Arial"/>
+          <w:b/>
+          <w:bCs/>
+          <w:sz w:val="24"/>
+          <w:szCs w:val="24"/>
+          <w:lang w:eastAsia="pt-BR"/>
+        </w:rPr>
+      </w:pPr>
+    </w:p>
+    <w:p>
+      <w:pPr>
+        <w:spacing w:before="100" w:beforeAutospacing="1" w:after="100" w:afterAutospacing="1" w:line="240" w:lineRule="auto"/>
+        <w:outlineLvl w:val="2"/>
+        <w:rPr>
+          <w:rFonts w:ascii="Arial" w:eastAsia="Times New Roman" w:hAnsi="Arial" w:cs="Arial"/>
+          <w:b/>
+          <w:bCs/>
+          <w:sz w:val="24"/>
+          <w:szCs w:val="24"/>
+          <w:lang w:eastAsia="pt-BR"/>
+        </w:rPr>
+      </w:pPr>
+    </w:p>
+    <w:p>
+      <w:pPr>
+        <w:spacing w:before="100" w:beforeAutospacing="1" w:after="100" w:afterAutospacing="1" w:line="240" w:lineRule="auto"/>
+        <w:outlineLvl w:val="2"/>
+        <w:rPr>
+          <w:rFonts w:ascii="Arial" w:eastAsia="Times New Roman" w:hAnsi="Arial" w:cs="Arial"/>
+          <w:b/>
+          <w:bCs/>
+          <w:sz w:val="24"/>
+          <w:szCs w:val="24"/>
+          <w:lang w:eastAsia="pt-BR"/>
+        </w:rPr>
+      </w:pPr>
+    </w:p>
+    <w:p>
+      <w:pPr>
+        <w:spacing w:before="100" w:beforeAutospacing="1" w:after="100" w:afterAutospacing="1" w:line="240" w:lineRule="auto"/>
+        <w:outlineLvl w:val="2"/>
+        <w:rPr>
+          <w:rFonts w:ascii="Arial" w:eastAsia="Times New Roman" w:hAnsi="Arial" w:cs="Arial"/>
+          <w:b/>
+          <w:bCs/>
+          <w:sz w:val="24"/>
+          <w:szCs w:val="24"/>
+          <w:lang w:eastAsia="pt-BR"/>
+        </w:rPr>
+      </w:pPr>
+    </w:p>
+    <w:p>
+      <w:pPr>
+        <w:spacing w:before="100" w:beforeAutospacing="1" w:after="100" w:afterAutospacing="1" w:line="240" w:lineRule="auto"/>
+        <w:outlineLvl w:val="2"/>
+        <w:rPr>
+          <w:rFonts w:ascii="Arial" w:eastAsia="Times New Roman" w:hAnsi="Arial" w:cs="Arial"/>
+          <w:b/>
+          <w:bCs/>
+          <w:sz w:val="24"/>
+          <w:szCs w:val="24"/>
+          <w:lang w:eastAsia="pt-BR"/>
+        </w:rPr>
+      </w:pPr>
+    </w:p>
+    <w:p>
+      <w:pPr>
+        <w:spacing w:before="100" w:beforeAutospacing="1" w:after="100" w:afterAutospacing="1" w:line="240" w:lineRule="auto"/>
+        <w:outlineLvl w:val="2"/>
+        <w:rPr>
+          <w:rFonts w:ascii="Arial" w:eastAsia="Times New Roman" w:hAnsi="Arial" w:cs="Arial"/>
+          <w:b/>
+          <w:bCs/>
+          <w:sz w:val="24"/>
+          <w:szCs w:val="24"/>
+          <w:lang w:eastAsia="pt-BR"/>
+        </w:rPr>
+      </w:pPr>
+    </w:p>
+    <w:p>
+      <w:pPr>
+        <w:spacing w:before="100" w:beforeAutospacing="1" w:after="100" w:afterAutospacing="1" w:line="240" w:lineRule="auto"/>
+        <w:outlineLvl w:val="2"/>
+        <w:rPr>
+          <w:rFonts w:ascii="Arial" w:eastAsia="Times New Roman" w:hAnsi="Arial" w:cs="Arial"/>
+          <w:b/>
+          <w:bCs/>
+          <w:sz w:val="24"/>
+          <w:szCs w:val="24"/>
+          <w:lang w:eastAsia="pt-BR"/>
+        </w:rPr>
+      </w:pPr>
+    </w:p>
+    <w:p>
+      <w:pPr>
+        <w:spacing w:before="100" w:beforeAutospacing="1" w:after="100" w:afterAutospacing="1" w:line="240" w:lineRule="auto"/>
+        <w:outlineLvl w:val="2"/>
+        <w:rPr>
+          <w:rFonts w:ascii="Arial" w:eastAsia="Times New Roman" w:hAnsi="Arial" w:cs="Arial"/>
+          <w:b/>
+          <w:bCs/>
+          <w:sz w:val="24"/>
+          <w:szCs w:val="24"/>
+          <w:lang w:eastAsia="pt-BR"/>
+        </w:rPr>
+      </w:pPr>
+    </w:p>
+    <w:p>
+      <w:pPr>
+        <w:spacing w:before="100" w:beforeAutospacing="1" w:after="100" w:afterAutospacing="1" w:line="240" w:lineRule="auto"/>
+        <w:outlineLvl w:val="2"/>
+        <w:rPr>
+          <w:rFonts w:ascii="Arial" w:eastAsia="Times New Roman" w:hAnsi="Arial" w:cs="Arial"/>
+          <w:b/>
+          <w:bCs/>
+          <w:sz w:val="24"/>
+          <w:szCs w:val="24"/>
+          <w:lang w:eastAsia="pt-BR"/>
+        </w:rPr>
+      </w:pPr>
+    </w:p>
+    <w:p>
+      <w:pPr>
+        <w:spacing w:before="100" w:beforeAutospacing="1" w:after="100" w:afterAutospacing="1" w:line="240" w:lineRule="auto"/>
+        <w:outlineLvl w:val="2"/>
+        <w:rPr>
+          <w:rFonts w:ascii="Arial" w:eastAsia="Times New Roman" w:hAnsi="Arial" w:cs="Arial"/>
+          <w:b/>
+          <w:bCs/>
+          <w:sz w:val="24"/>
+          <w:szCs w:val="24"/>
+          <w:lang w:eastAsia="pt-BR"/>
+        </w:rPr>
+      </w:pPr>
+    </w:p>
+    <w:p>
+      <w:pPr>
+        <w:spacing w:before="100" w:beforeAutospacing="1" w:after="100" w:afterAutospacing="1" w:line="240" w:lineRule="auto"/>
+        <w:outlineLvl w:val="2"/>
+        <w:rPr>
+          <w:rFonts w:ascii="Arial" w:eastAsia="Times New Roman" w:hAnsi="Arial" w:cs="Arial"/>
+          <w:b/>
+          <w:bCs/>
+          <w:sz w:val="24"/>
+          <w:szCs w:val="24"/>
+          <w:lang w:eastAsia="pt-BR"/>
+        </w:rPr>
+      </w:pPr>
+      <w:bookmarkStart w:id="1" w:name="_Toc226959800"/>
+      <w:r>
+        <w:rPr>
+          <w:rFonts w:ascii="Arial" w:eastAsia="Times New Roman" w:hAnsi="Arial" w:cs="Arial"/>
+          <w:b/>
+          <w:bCs/>
+          <w:sz w:val="24"/>
+          <w:szCs w:val="24"/>
+          <w:lang w:eastAsia="pt-BR"/>
+        </w:rPr>
+        <w:t>Descrição do Problema</w:t>
+      </w:r>
+      <w:bookmarkEnd w:id="1"/>
+    </w:p>
+    <w:p>
+      <w:pPr>
+        <w:spacing w:before="100" w:beforeAutospacing="1" w:after="100" w:afterAutospacing="1" w:line="240" w:lineRule="auto"/>
+        <w:jc w:val="both"/>
+        <w:rPr>
+          <w:rFonts w:ascii="Arial" w:eastAsia="Times New Roman" w:hAnsi="Arial" w:cs="Arial"/>
+          <w:sz w:val="24"/>
+          <w:szCs w:val="24"/>
+          <w:lang w:eastAsia="pt-BR"/>
+        </w:rPr>
+      </w:pPr>
+      <w:r>
+        <w:rPr>
+          <w:rFonts w:ascii="Arial" w:eastAsia="Times New Roman" w:hAnsi="Arial" w:cs="Arial"/>
+          <w:sz w:val="24"/>
+          <w:szCs w:val="24"/>
+          <w:lang w:eastAsia="pt-BR"/>
+        </w:rPr>
+        <w:t xml:space="preserve">A mobilidade urbana representa um desafio significativo para pessoas com deficiência visual, mesmo com o uso de dispositivos </w:t>
+      </w:r>
+      <w:proofErr w:type="spellStart"/>
+      <w:r>
+        <w:rPr>
+          <w:rFonts w:ascii="Arial" w:eastAsia="Times New Roman" w:hAnsi="Arial" w:cs="Arial"/>
+          <w:sz w:val="24"/>
+          <w:szCs w:val="24"/>
+          <w:lang w:eastAsia="pt-BR"/>
+        </w:rPr>
+        <w:t>assistivos</w:t>
+      </w:r>
+      <w:proofErr w:type="spellEnd"/>
+      <w:r>
+        <w:rPr>
+          <w:rFonts w:ascii="Arial" w:eastAsia="Times New Roman" w:hAnsi="Arial" w:cs="Arial"/>
+          <w:sz w:val="24"/>
+          <w:szCs w:val="24"/>
+          <w:lang w:eastAsia="pt-BR"/>
+        </w:rPr>
+        <w:t xml:space="preserve"> tradicionais, como a bengala convencional. Embora esse instrumento seja amplamente utilizado e eficaz na detecção de obstáculos ao nível do solo, apresenta limitações relevantes que comprometem a segurança e a autonomia do usuário. Entre essas limitações, destaca-se a incapacidade de identificar obstáculos suspensos, tais como galhos de árvores, placas e estruturas elevadas, bem como a dificuldade em detectar desníveis mais profundos com antecedência.</w:t>
+      </w:r>
+    </w:p>
+    <w:p>
+      <w:pPr>
+        <w:spacing w:before="100" w:beforeAutospacing="1" w:after="100" w:afterAutospacing="1" w:line="240" w:lineRule="auto"/>
+        <w:jc w:val="both"/>
+        <w:rPr>
+          <w:rFonts w:ascii="Arial" w:eastAsia="Times New Roman" w:hAnsi="Arial" w:cs="Arial"/>
+          <w:sz w:val="24"/>
+          <w:szCs w:val="24"/>
+          <w:lang w:eastAsia="pt-BR"/>
+        </w:rPr>
+      </w:pPr>
+      <w:r>
+        <w:rPr>
+          <w:rFonts w:ascii="Arial" w:eastAsia="Times New Roman" w:hAnsi="Arial" w:cs="Arial"/>
+          <w:sz w:val="24"/>
+          <w:szCs w:val="24"/>
+          <w:lang w:eastAsia="pt-BR"/>
+        </w:rPr>
+        <w:t>Adicionalmente, a bengala tradicional não dispõe de recursos tecnológicos capazes de fornecer feedback inteligente ou orientação espacial detalhada, tampouco permite integração com sistemas de navegação digital. Essa ausência de funcionalidades avançadas reduz significativamente a eficiência do dispositivo em ambientes urbanos complexos, nos quais a variabilidade de obstáculos e a dinâmica do espaço exigem respostas mais rápidas e precisas.</w:t>
+      </w:r>
+    </w:p>
+    <w:p>
+      <w:pPr>
+        <w:spacing w:before="100" w:beforeAutospacing="1" w:after="100" w:afterAutospacing="1" w:line="240" w:lineRule="auto"/>
+        <w:outlineLvl w:val="2"/>
+        <w:rPr>
+          <w:rFonts w:ascii="Arial" w:eastAsia="Times New Roman" w:hAnsi="Arial" w:cs="Arial"/>
+          <w:b/>
+          <w:bCs/>
+          <w:sz w:val="24"/>
+          <w:szCs w:val="24"/>
+          <w:lang w:eastAsia="pt-BR"/>
+        </w:rPr>
+      </w:pPr>
+      <w:bookmarkStart w:id="2" w:name="_Toc226959801"/>
+      <w:r>
+        <w:rPr>
+          <w:rFonts w:ascii="Arial" w:eastAsia="Times New Roman" w:hAnsi="Arial" w:cs="Arial"/>
+          <w:b/>
+          <w:bCs/>
+          <w:sz w:val="24"/>
+          <w:szCs w:val="24"/>
+          <w:lang w:eastAsia="pt-BR"/>
         </w:rPr>
         <w:t>Solução Proposta</w:t>
       </w:r>
-      <w:r>
-        <w:rPr>
-          <w:rFonts w:ascii="Arial" w:hAnsi="Arial" w:cs="Arial"/>
-        </w:rPr>
-        <w:br/>
-        <w:t>O projeto propõe o desenvolvimento de uma bengala inteligente equipada com sensores ultrassônicos e câmeras, capaz de detectar obstáculos em diferentes alturas e distâncias. A bengala também incorpora um sistema de vibração e áudio para alertar o usuário em tempo real. Além disso, integra-se a um aplicativo móvel com GPS, permitindo navegação assistida e identificação de rotas seguras. A melhoria proposta em relação a versões existentes está na inclusão de inteligência adaptativa, que aprende com o ambiente e com o comportamento do usuário ao longo do tempo.</w:t>
-      </w:r>
-    </w:p>
-    <w:p>
-      <w:pPr>
-        <w:pStyle w:val="NormalWeb"/>
-        <w:rPr>
-          <w:rFonts w:ascii="Arial" w:hAnsi="Arial" w:cs="Arial"/>
-        </w:rPr>
-      </w:pPr>
-      <w:r>
-        <w:rPr>
-          <w:rStyle w:val="Forte"/>
-          <w:rFonts w:ascii="Arial" w:hAnsi="Arial" w:cs="Arial"/>
-        </w:rPr>
-        <w:t>Como a IA foi aplicada</w:t>
-      </w:r>
-      <w:r>
-        <w:rPr>
-          <w:rFonts w:ascii="Arial" w:hAnsi="Arial" w:cs="Arial"/>
-        </w:rPr>
-        <w:br/>
-        <w:t>A Inteligência Artificial foi aplicada principalmente por meio de algoritmos de visão computacional e aprendizado de máquina. A câmera acoplada à bengala captura imagens do ambiente, que são processadas por um modelo treinado para reconhecer obstáculos, sinalizações e padrões urbanos. Além disso, um sistema de aprendizado contínuo analisa os trajetos do usuário, ajustando os alertas conforme suas preferências e rotinas. A IA também contribui na filtragem de informações, evitando excesso de alertas desnecessários e priorizando riscos reais.</w:t>
-      </w:r>
-    </w:p>
-    <w:p>
-      <w:pPr>
-        <w:pStyle w:val="NormalWeb"/>
-        <w:rPr>
-          <w:rFonts w:ascii="Arial" w:hAnsi="Arial" w:cs="Arial"/>
-        </w:rPr>
-      </w:pPr>
-      <w:r>
-        <w:rPr>
-          <w:rStyle w:val="Forte"/>
-          <w:rFonts w:ascii="Arial" w:hAnsi="Arial" w:cs="Arial"/>
-        </w:rPr>
-        <w:t>Resultados Obtidos</w:t>
-      </w:r>
-      <w:r>
-        <w:rPr>
-          <w:rFonts w:ascii="Arial" w:hAnsi="Arial" w:cs="Arial"/>
-        </w:rPr>
-        <w:br/>
-        <w:t>Os testes iniciais demonstraram aumento significativo na segurança e autonomia dos usuários. A detecção de obstáculos suspensos foi ampliada em comparação à bengala tradicional, reduzindo acidentes. Usuários relataram maior confiança durante deslocamentos em ambientes urbanos. No entanto, foi identificada uma limitação relacionada ao consumo de energia e à dependência de conexão com internet para algumas funcionalidades. Como melhoria futura, propõe-se otimizar o consumo energético e implementar maior capacidade de processamento offline, tornando o dispositivo mais eficiente e acessível.</w:t>
-      </w:r>
-    </w:p>
-    <w:p>
-      <w:pPr>
-        <w:jc w:val="center"/>
+      <w:bookmarkEnd w:id="2"/>
+    </w:p>
+    <w:p>
+      <w:pPr>
+        <w:spacing w:before="100" w:beforeAutospacing="1" w:after="100" w:afterAutospacing="1" w:line="240" w:lineRule="auto"/>
+        <w:jc w:val="both"/>
+        <w:rPr>
+          <w:rFonts w:ascii="Arial" w:eastAsia="Times New Roman" w:hAnsi="Arial" w:cs="Arial"/>
+          <w:sz w:val="24"/>
+          <w:szCs w:val="24"/>
+          <w:lang w:eastAsia="pt-BR"/>
+        </w:rPr>
+      </w:pPr>
+      <w:r>
+        <w:rPr>
+          <w:rFonts w:ascii="Arial" w:eastAsia="Times New Roman" w:hAnsi="Arial" w:cs="Arial"/>
+          <w:sz w:val="24"/>
+          <w:szCs w:val="24"/>
+          <w:lang w:eastAsia="pt-BR"/>
+        </w:rPr>
+        <w:t>Diante das limitações identificadas, propõe-se o desenvolvimento de uma bengala inteligente, equipada com sensores ultrassônicos e câmeras, com o objetivo de ampliar a capacidade de detecção de obstáculos em diferentes alturas e distâncias. O dispositivo é projetado para oferecer ao usuário um sistema de alerta em tempo real, por meio de vibração e sinais sonoros, possibilitando respostas rápidas e seguras durante a locomoção.</w:t>
+      </w:r>
+    </w:p>
+    <w:p>
+      <w:pPr>
+        <w:spacing w:before="100" w:beforeAutospacing="1" w:after="100" w:afterAutospacing="1" w:line="240" w:lineRule="auto"/>
+        <w:jc w:val="both"/>
+        <w:rPr>
+          <w:rFonts w:ascii="Arial" w:eastAsia="Times New Roman" w:hAnsi="Arial" w:cs="Arial"/>
+          <w:sz w:val="24"/>
+          <w:szCs w:val="24"/>
+          <w:lang w:eastAsia="pt-BR"/>
+        </w:rPr>
+      </w:pPr>
+      <w:r>
+        <w:rPr>
+          <w:rFonts w:ascii="Arial" w:eastAsia="Times New Roman" w:hAnsi="Arial" w:cs="Arial"/>
+          <w:sz w:val="24"/>
+          <w:szCs w:val="24"/>
+          <w:lang w:eastAsia="pt-BR"/>
+        </w:rPr>
+        <w:t>Além disso, a solução contempla a integração com um aplicativo móvel dotado de tecnologia GPS, permitindo a navegação assistida e a identificação de rotas mais seguras. Um diferencial relevante do projeto em relação a soluções já existentes consiste na incorporação de inteligência adaptativa, capaz de aprender continuamente com o ambiente e com o comportamento do usuário, ajustando suas funcionalidades conforme padrões de uso e preferências individuais.</w:t>
+      </w:r>
+    </w:p>
+    <w:p>
+      <w:pPr>
+        <w:spacing w:before="100" w:beforeAutospacing="1" w:after="100" w:afterAutospacing="1" w:line="240" w:lineRule="auto"/>
+        <w:outlineLvl w:val="2"/>
+        <w:rPr>
+          <w:rFonts w:ascii="Arial" w:eastAsia="Times New Roman" w:hAnsi="Arial" w:cs="Arial"/>
+          <w:b/>
+          <w:bCs/>
+          <w:sz w:val="24"/>
+          <w:szCs w:val="24"/>
+          <w:lang w:eastAsia="pt-BR"/>
+        </w:rPr>
+      </w:pPr>
+      <w:bookmarkStart w:id="3" w:name="_Toc226959802"/>
+      <w:r>
+        <w:rPr>
+          <w:rFonts w:ascii="Arial" w:eastAsia="Times New Roman" w:hAnsi="Arial" w:cs="Arial"/>
+          <w:b/>
+          <w:bCs/>
+          <w:sz w:val="24"/>
+          <w:szCs w:val="24"/>
+          <w:lang w:eastAsia="pt-BR"/>
+        </w:rPr>
+        <w:t>Aplicação da Inteligência Artificial</w:t>
+      </w:r>
+      <w:bookmarkEnd w:id="3"/>
+    </w:p>
+    <w:p>
+      <w:pPr>
+        <w:spacing w:before="100" w:beforeAutospacing="1" w:after="100" w:afterAutospacing="1" w:line="240" w:lineRule="auto"/>
+        <w:jc w:val="both"/>
+        <w:rPr>
+          <w:rFonts w:ascii="Arial" w:eastAsia="Times New Roman" w:hAnsi="Arial" w:cs="Arial"/>
+          <w:sz w:val="24"/>
+          <w:szCs w:val="24"/>
+          <w:lang w:eastAsia="pt-BR"/>
+        </w:rPr>
+      </w:pPr>
+      <w:r>
+        <w:rPr>
+          <w:rFonts w:ascii="Arial" w:eastAsia="Times New Roman" w:hAnsi="Arial" w:cs="Arial"/>
+          <w:sz w:val="24"/>
+          <w:szCs w:val="24"/>
+          <w:lang w:eastAsia="pt-BR"/>
+        </w:rPr>
+        <w:t xml:space="preserve">A utilização da Inteligência Artificial (IA) constitui um elemento central no desenvolvimento da solução proposta. Sua aplicação ocorre, principalmente, por meio de técnicas de visão computacional e algoritmos de aprendizado de máquina. A câmera acoplada à bengala realiza a captura de imagens do ambiente, que são posteriormente processadas por modelos treinados para </w:t>
+      </w:r>
+      <w:r>
+        <w:rPr>
+          <w:rFonts w:ascii="Arial" w:eastAsia="Times New Roman" w:hAnsi="Arial" w:cs="Arial"/>
+          <w:sz w:val="24"/>
+          <w:szCs w:val="24"/>
+          <w:lang w:eastAsia="pt-BR"/>
+        </w:rPr>
+        <w:lastRenderedPageBreak/>
+        <w:t>reconhecer diferentes tipos de obstáculos, sinalizações e elementos característicos do espaço urbano.</w:t>
+      </w:r>
+    </w:p>
+    <w:p>
+      <w:pPr>
+        <w:spacing w:before="100" w:beforeAutospacing="1" w:after="100" w:afterAutospacing="1" w:line="240" w:lineRule="auto"/>
+        <w:jc w:val="both"/>
+        <w:rPr>
+          <w:rFonts w:ascii="Arial" w:eastAsia="Times New Roman" w:hAnsi="Arial" w:cs="Arial"/>
+          <w:sz w:val="24"/>
+          <w:szCs w:val="24"/>
+          <w:lang w:eastAsia="pt-BR"/>
+        </w:rPr>
+      </w:pPr>
+      <w:r>
+        <w:rPr>
+          <w:rFonts w:ascii="Arial" w:eastAsia="Times New Roman" w:hAnsi="Arial" w:cs="Arial"/>
+          <w:sz w:val="24"/>
+          <w:szCs w:val="24"/>
+          <w:lang w:eastAsia="pt-BR"/>
+        </w:rPr>
+        <w:t>Ademais, o sistema incorpora mecanismos de aprendizado contínuo, que analisam os trajetos percorridos pelo usuário, permitindo a personalização dos alertas de acordo com suas rotinas e preferências. A IA também desempenha um papel fundamental na filtragem das informações geradas, reduzindo a ocorrência de alertas desnecessários e priorizando situações que representem riscos reais, contribuindo, assim, para uma experiência mais eficiente e menos sobrecarregada.</w:t>
+      </w:r>
+    </w:p>
+    <w:p>
+      <w:pPr>
+        <w:spacing w:before="100" w:beforeAutospacing="1" w:after="100" w:afterAutospacing="1" w:line="240" w:lineRule="auto"/>
+        <w:outlineLvl w:val="2"/>
+        <w:rPr>
+          <w:rFonts w:ascii="Arial" w:eastAsia="Times New Roman" w:hAnsi="Arial" w:cs="Arial"/>
+          <w:b/>
+          <w:bCs/>
+          <w:sz w:val="27"/>
+          <w:szCs w:val="27"/>
+          <w:lang w:eastAsia="pt-BR"/>
+        </w:rPr>
+      </w:pPr>
+      <w:bookmarkStart w:id="4" w:name="_Toc226959803"/>
+      <w:r>
+        <w:rPr>
+          <w:rFonts w:ascii="Arial" w:eastAsia="Times New Roman" w:hAnsi="Arial" w:cs="Arial"/>
+          <w:b/>
+          <w:bCs/>
+          <w:sz w:val="24"/>
+          <w:szCs w:val="24"/>
+          <w:lang w:eastAsia="pt-BR"/>
+        </w:rPr>
+        <w:t>Resultados</w:t>
+      </w:r>
+      <w:r>
+        <w:rPr>
+          <w:rFonts w:ascii="Arial" w:eastAsia="Times New Roman" w:hAnsi="Arial" w:cs="Arial"/>
+          <w:b/>
+          <w:bCs/>
+          <w:sz w:val="27"/>
+          <w:szCs w:val="27"/>
+          <w:lang w:eastAsia="pt-BR"/>
+        </w:rPr>
+        <w:t xml:space="preserve"> </w:t>
+      </w:r>
+      <w:r>
+        <w:rPr>
+          <w:rFonts w:ascii="Arial" w:eastAsia="Times New Roman" w:hAnsi="Arial" w:cs="Arial"/>
+          <w:b/>
+          <w:bCs/>
+          <w:sz w:val="24"/>
+          <w:szCs w:val="24"/>
+          <w:lang w:eastAsia="pt-BR"/>
+        </w:rPr>
+        <w:t>Obtidos</w:t>
+      </w:r>
+      <w:bookmarkEnd w:id="4"/>
+    </w:p>
+    <w:p>
+      <w:pPr>
+        <w:spacing w:before="100" w:beforeAutospacing="1" w:after="100" w:afterAutospacing="1" w:line="240" w:lineRule="auto"/>
+        <w:jc w:val="both"/>
+        <w:rPr>
+          <w:rFonts w:ascii="Arial" w:eastAsia="Times New Roman" w:hAnsi="Arial" w:cs="Arial"/>
+          <w:sz w:val="24"/>
+          <w:szCs w:val="24"/>
+          <w:lang w:eastAsia="pt-BR"/>
+        </w:rPr>
+      </w:pPr>
+      <w:r>
+        <w:rPr>
+          <w:rFonts w:ascii="Arial" w:eastAsia="Times New Roman" w:hAnsi="Arial" w:cs="Arial"/>
+          <w:sz w:val="24"/>
+          <w:szCs w:val="24"/>
+          <w:lang w:eastAsia="pt-BR"/>
+        </w:rPr>
+        <w:t>Os testes iniciais realizados com o protótipo demonstraram resultados promissores no que se refere ao aumento da segurança e da autonomia dos usuários. Observou-se uma melhoria significativa na detecção de obstáculos suspensos, em comparação com a bengala tradicional, o que contribuiu para a redução de acidentes durante a locomoção.</w:t>
+      </w:r>
+    </w:p>
+    <w:p>
+      <w:pPr>
+        <w:spacing w:before="100" w:beforeAutospacing="1" w:after="100" w:afterAutospacing="1" w:line="240" w:lineRule="auto"/>
+        <w:jc w:val="both"/>
+        <w:rPr>
+          <w:rFonts w:ascii="Arial" w:eastAsia="Times New Roman" w:hAnsi="Arial" w:cs="Arial"/>
+          <w:sz w:val="24"/>
+          <w:szCs w:val="24"/>
+          <w:lang w:eastAsia="pt-BR"/>
+        </w:rPr>
+      </w:pPr>
+      <w:r>
+        <w:rPr>
+          <w:rFonts w:ascii="Arial" w:eastAsia="Times New Roman" w:hAnsi="Arial" w:cs="Arial"/>
+          <w:sz w:val="24"/>
+          <w:szCs w:val="24"/>
+          <w:lang w:eastAsia="pt-BR"/>
+        </w:rPr>
+        <w:t>Além disso, os usuários relataram maior confiança e sensação de segurança ao se deslocarem em ambientes urbanos. Entretanto, também foram identificadas limitações relacionadas ao consumo elevado de energia do dispositivo e à dependência de conexão com a internet para o funcionamento de determinadas funcionalidades.</w:t>
+      </w:r>
+    </w:p>
+    <w:p>
+      <w:pPr>
+        <w:spacing w:before="100" w:beforeAutospacing="1" w:after="100" w:afterAutospacing="1" w:line="240" w:lineRule="auto"/>
+        <w:jc w:val="both"/>
+        <w:rPr>
+          <w:rFonts w:ascii="Arial" w:eastAsia="Times New Roman" w:hAnsi="Arial" w:cs="Arial"/>
+          <w:sz w:val="24"/>
+          <w:szCs w:val="24"/>
+          <w:lang w:eastAsia="pt-BR"/>
+        </w:rPr>
+      </w:pPr>
+      <w:r>
+        <w:rPr>
+          <w:rFonts w:ascii="Arial" w:eastAsia="Times New Roman" w:hAnsi="Arial" w:cs="Arial"/>
+          <w:sz w:val="24"/>
+          <w:szCs w:val="24"/>
+          <w:lang w:eastAsia="pt-BR"/>
+        </w:rPr>
+        <w:t xml:space="preserve">Como perspectivas de aprimoramento, propõe-se a otimização do consumo energético e a ampliação da capacidade de processamento </w:t>
+      </w:r>
+      <w:proofErr w:type="spellStart"/>
+      <w:r>
+        <w:rPr>
+          <w:rFonts w:ascii="Arial" w:eastAsia="Times New Roman" w:hAnsi="Arial" w:cs="Arial"/>
+          <w:sz w:val="24"/>
+          <w:szCs w:val="24"/>
+          <w:lang w:eastAsia="pt-BR"/>
+        </w:rPr>
+        <w:t>offline</w:t>
+      </w:r>
+      <w:proofErr w:type="spellEnd"/>
+      <w:r>
+        <w:rPr>
+          <w:rFonts w:ascii="Arial" w:eastAsia="Times New Roman" w:hAnsi="Arial" w:cs="Arial"/>
+          <w:sz w:val="24"/>
+          <w:szCs w:val="24"/>
+          <w:lang w:eastAsia="pt-BR"/>
+        </w:rPr>
+        <w:t>, com o intuito de tornar o dispositivo mais eficiente, acessível e adequado a diferentes contextos de uso.</w:t>
+      </w:r>
+    </w:p>
+    <w:p>
+      <w:pPr>
+        <w:jc w:val="both"/>
         <w:rPr>
           <w:rFonts w:ascii="Arial" w:hAnsi="Arial" w:cs="Arial"/>
           <w:sz w:val="24"/>
@@ -484,7 +1443,7 @@
     </w:p>
     <w:sectPr>
       <w:pgSz w:w="11906" w:h="16838"/>
-      <w:pgMar w:top="1417" w:right="1701" w:bottom="1417" w:left="1701" w:header="708" w:footer="708" w:gutter="0"/>
+      <w:pgMar w:top="1418" w:right="1701" w:bottom="1418" w:left="1701" w:header="709" w:footer="709" w:gutter="0"/>
       <w:cols w:space="708"/>
       <w:docGrid w:linePitch="360"/>
     </w:sectPr>
@@ -492,8 +1451,194 @@
 </w:document>
 </file>
 
+<file path=word/numbering.xml><?xml version="1.0" encoding="utf-8"?>
+<w:numbering xmlns:wpc="http://schemas.microsoft.com/office/word/2010/wordprocessingCanvas" xmlns:cx="http://schemas.microsoft.com/office/drawing/2014/chartex" xmlns:mc="http://schemas.openxmlformats.org/markup-compatibility/2006" xmlns:o="urn:schemas-microsoft-com:office:office" xmlns:r="http://schemas.openxmlformats.org/officeDocument/2006/relationships" xmlns:m="http://schemas.openxmlformats.org/officeDocument/2006/math" xmlns:v="urn:schemas-microsoft-com:vml" xmlns:wp14="http://schemas.microsoft.com/office/word/2010/wordprocessingDrawing" xmlns:wp="http://schemas.openxmlformats.org/drawingml/2006/wordprocessingDrawing" xmlns:w10="urn:schemas-microsoft-com:office:word" xmlns:w="http://schemas.openxmlformats.org/wordprocessingml/2006/main" xmlns:w14="http://schemas.microsoft.com/office/word/2010/wordml" xmlns:w15="http://schemas.microsoft.com/office/word/2012/wordml" xmlns:w16se="http://schemas.microsoft.com/office/word/2015/wordml/symex" xmlns:wpg="http://schemas.microsoft.com/office/word/2010/wordprocessingGroup" xmlns:wpi="http://schemas.microsoft.com/office/word/2010/wordprocessingInk" xmlns:wne="http://schemas.microsoft.com/office/word/2006/wordml" xmlns:wps="http://schemas.microsoft.com/office/word/2010/wordprocessingShape" mc:Ignorable="w14 w15 w16se wp14">
+  <w:abstractNum w:abstractNumId="0" w15:restartNumberingAfterBreak="0">
+    <w:nsid w:val="77BC31F2"/>
+    <w:multiLevelType w:val="hybridMultilevel"/>
+    <w:tmpl w:val="85EAE308"/>
+    <w:lvl w:ilvl="0" w:tplc="0416000F">
+      <w:start w:val="1"/>
+      <w:numFmt w:val="decimal"/>
+      <w:lvlText w:val="%1."/>
+      <w:lvlJc w:val="left"/>
+      <w:pPr>
+        <w:ind w:left="720" w:hanging="360"/>
+      </w:pPr>
+      <w:rPr>
+        <w:rFonts w:hint="default"/>
+      </w:rPr>
+    </w:lvl>
+    <w:lvl w:ilvl="1" w:tplc="04160019" w:tentative="1">
+      <w:start w:val="1"/>
+      <w:numFmt w:val="lowerLetter"/>
+      <w:lvlText w:val="%2."/>
+      <w:lvlJc w:val="left"/>
+      <w:pPr>
+        <w:ind w:left="1440" w:hanging="360"/>
+      </w:pPr>
+    </w:lvl>
+    <w:lvl w:ilvl="2" w:tplc="0416001B" w:tentative="1">
+      <w:start w:val="1"/>
+      <w:numFmt w:val="lowerRoman"/>
+      <w:lvlText w:val="%3."/>
+      <w:lvlJc w:val="right"/>
+      <w:pPr>
+        <w:ind w:left="2160" w:hanging="180"/>
+      </w:pPr>
+    </w:lvl>
+    <w:lvl w:ilvl="3" w:tplc="0416000F" w:tentative="1">
+      <w:start w:val="1"/>
+      <w:numFmt w:val="decimal"/>
+      <w:lvlText w:val="%4."/>
+      <w:lvlJc w:val="left"/>
+      <w:pPr>
+        <w:ind w:left="2880" w:hanging="360"/>
+      </w:pPr>
+    </w:lvl>
+    <w:lvl w:ilvl="4" w:tplc="04160019" w:tentative="1">
+      <w:start w:val="1"/>
+      <w:numFmt w:val="lowerLetter"/>
+      <w:lvlText w:val="%5."/>
+      <w:lvlJc w:val="left"/>
+      <w:pPr>
+        <w:ind w:left="3600" w:hanging="360"/>
+      </w:pPr>
+    </w:lvl>
+    <w:lvl w:ilvl="5" w:tplc="0416001B" w:tentative="1">
+      <w:start w:val="1"/>
+      <w:numFmt w:val="lowerRoman"/>
+      <w:lvlText w:val="%6."/>
+      <w:lvlJc w:val="right"/>
+      <w:pPr>
+        <w:ind w:left="4320" w:hanging="180"/>
+      </w:pPr>
+    </w:lvl>
+    <w:lvl w:ilvl="6" w:tplc="0416000F" w:tentative="1">
+      <w:start w:val="1"/>
+      <w:numFmt w:val="decimal"/>
+      <w:lvlText w:val="%7."/>
+      <w:lvlJc w:val="left"/>
+      <w:pPr>
+        <w:ind w:left="5040" w:hanging="360"/>
+      </w:pPr>
+    </w:lvl>
+    <w:lvl w:ilvl="7" w:tplc="04160019" w:tentative="1">
+      <w:start w:val="1"/>
+      <w:numFmt w:val="lowerLetter"/>
+      <w:lvlText w:val="%8."/>
+      <w:lvlJc w:val="left"/>
+      <w:pPr>
+        <w:ind w:left="5760" w:hanging="360"/>
+      </w:pPr>
+    </w:lvl>
+    <w:lvl w:ilvl="8" w:tplc="0416001B" w:tentative="1">
+      <w:start w:val="1"/>
+      <w:numFmt w:val="lowerRoman"/>
+      <w:lvlText w:val="%9."/>
+      <w:lvlJc w:val="right"/>
+      <w:pPr>
+        <w:ind w:left="6480" w:hanging="180"/>
+      </w:pPr>
+    </w:lvl>
+  </w:abstractNum>
+  <w:abstractNum w:abstractNumId="1" w15:restartNumberingAfterBreak="0">
+    <w:nsid w:val="7EBF3251"/>
+    <w:multiLevelType w:val="hybridMultilevel"/>
+    <w:tmpl w:val="93B04DA0"/>
+    <w:lvl w:ilvl="0" w:tplc="0416000F">
+      <w:start w:val="1"/>
+      <w:numFmt w:val="decimal"/>
+      <w:lvlText w:val="%1."/>
+      <w:lvlJc w:val="left"/>
+      <w:pPr>
+        <w:ind w:left="720" w:hanging="360"/>
+      </w:pPr>
+    </w:lvl>
+    <w:lvl w:ilvl="1" w:tplc="04160019" w:tentative="1">
+      <w:start w:val="1"/>
+      <w:numFmt w:val="lowerLetter"/>
+      <w:lvlText w:val="%2."/>
+      <w:lvlJc w:val="left"/>
+      <w:pPr>
+        <w:ind w:left="1440" w:hanging="360"/>
+      </w:pPr>
+    </w:lvl>
+    <w:lvl w:ilvl="2" w:tplc="0416001B" w:tentative="1">
+      <w:start w:val="1"/>
+      <w:numFmt w:val="lowerRoman"/>
+      <w:lvlText w:val="%3."/>
+      <w:lvlJc w:val="right"/>
+      <w:pPr>
+        <w:ind w:left="2160" w:hanging="180"/>
+      </w:pPr>
+    </w:lvl>
+    <w:lvl w:ilvl="3" w:tplc="0416000F" w:tentative="1">
+      <w:start w:val="1"/>
+      <w:numFmt w:val="decimal"/>
+      <w:lvlText w:val="%4."/>
+      <w:lvlJc w:val="left"/>
+      <w:pPr>
+        <w:ind w:left="2880" w:hanging="360"/>
+      </w:pPr>
+    </w:lvl>
+    <w:lvl w:ilvl="4" w:tplc="04160019" w:tentative="1">
+      <w:start w:val="1"/>
+      <w:numFmt w:val="lowerLetter"/>
+      <w:lvlText w:val="%5."/>
+      <w:lvlJc w:val="left"/>
+      <w:pPr>
+        <w:ind w:left="3600" w:hanging="360"/>
+      </w:pPr>
+    </w:lvl>
+    <w:lvl w:ilvl="5" w:tplc="0416001B" w:tentative="1">
+      <w:start w:val="1"/>
+      <w:numFmt w:val="lowerRoman"/>
+      <w:lvlText w:val="%6."/>
+      <w:lvlJc w:val="right"/>
+      <w:pPr>
+        <w:ind w:left="4320" w:hanging="180"/>
+      </w:pPr>
+    </w:lvl>
+    <w:lvl w:ilvl="6" w:tplc="0416000F" w:tentative="1">
+      <w:start w:val="1"/>
+      <w:numFmt w:val="decimal"/>
+      <w:lvlText w:val="%7."/>
+      <w:lvlJc w:val="left"/>
+      <w:pPr>
+        <w:ind w:left="5040" w:hanging="360"/>
+      </w:pPr>
+    </w:lvl>
+    <w:lvl w:ilvl="7" w:tplc="04160019" w:tentative="1">
+      <w:start w:val="1"/>
+      <w:numFmt w:val="lowerLetter"/>
+      <w:lvlText w:val="%8."/>
+      <w:lvlJc w:val="left"/>
+      <w:pPr>
+        <w:ind w:left="5760" w:hanging="360"/>
+      </w:pPr>
+    </w:lvl>
+    <w:lvl w:ilvl="8" w:tplc="0416001B" w:tentative="1">
+      <w:start w:val="1"/>
+      <w:numFmt w:val="lowerRoman"/>
+      <w:lvlText w:val="%9."/>
+      <w:lvlJc w:val="right"/>
+      <w:pPr>
+        <w:ind w:left="6480" w:hanging="180"/>
+      </w:pPr>
+    </w:lvl>
+  </w:abstractNum>
+  <w:num w:numId="1">
+    <w:abstractNumId w:val="1"/>
+  </w:num>
+  <w:num w:numId="2">
+    <w:abstractNumId w:val="0"/>
+  </w:num>
+</w:numbering>
+</file>
+
 <file path=word/styles.xml><?xml version="1.0" encoding="utf-8"?>
-<w:styles xmlns:mc="http://schemas.openxmlformats.org/markup-compatibility/2006" xmlns:r="http://schemas.openxmlformats.org/officeDocument/2006/relationships" xmlns:w="http://schemas.openxmlformats.org/wordprocessingml/2006/main" xmlns:w14="http://schemas.microsoft.com/office/word/2010/wordml" xmlns:w15="http://schemas.microsoft.com/office/word/2012/wordml" xmlns:w16cid="http://schemas.microsoft.com/office/word/2016/wordml/cid" xmlns:w16se="http://schemas.microsoft.com/office/word/2015/wordml/symex" mc:Ignorable="w14 w15 w16se w16cid">
+<w:styles xmlns:mc="http://schemas.openxmlformats.org/markup-compatibility/2006" xmlns:r="http://schemas.openxmlformats.org/officeDocument/2006/relationships" xmlns:w="http://schemas.openxmlformats.org/wordprocessingml/2006/main" xmlns:w14="http://schemas.microsoft.com/office/word/2010/wordml" xmlns:w15="http://schemas.microsoft.com/office/word/2012/wordml" xmlns:w16se="http://schemas.microsoft.com/office/word/2015/wordml/symex" mc:Ignorable="w14 w15 w16se">
   <w:docDefaults>
     <w:rPrDefault>
       <w:rPr>
@@ -509,7 +1654,7 @@
       </w:pPr>
     </w:pPrDefault>
   </w:docDefaults>
-  <w:latentStyles w:defLockedState="0" w:defUIPriority="99" w:defSemiHidden="0" w:defUnhideWhenUsed="0" w:defQFormat="0" w:count="375">
+  <w:latentStyles w:defLockedState="0" w:defUIPriority="99" w:defSemiHidden="0" w:defUnhideWhenUsed="0" w:defQFormat="0" w:count="371">
     <w:lsdException w:name="Normal" w:uiPriority="0" w:qFormat="1"/>
     <w:lsdException w:name="heading 1" w:uiPriority="9" w:qFormat="1"/>
     <w:lsdException w:name="heading 2" w:semiHidden="1" w:uiPriority="9" w:unhideWhenUsed="1" w:qFormat="1"/>
@@ -881,14 +2026,51 @@
     <w:lsdException w:name="List Table 5 Dark Accent 6" w:uiPriority="50"/>
     <w:lsdException w:name="List Table 6 Colorful Accent 6" w:uiPriority="51"/>
     <w:lsdException w:name="List Table 7 Colorful Accent 6" w:uiPriority="52"/>
-    <w:lsdException w:name="Mention" w:semiHidden="1" w:unhideWhenUsed="1"/>
-    <w:lsdException w:name="Smart Hyperlink" w:semiHidden="1" w:unhideWhenUsed="1"/>
-    <w:lsdException w:name="Hashtag" w:semiHidden="1" w:unhideWhenUsed="1"/>
-    <w:lsdException w:name="Unresolved Mention" w:semiHidden="1" w:unhideWhenUsed="1"/>
   </w:latentStyles>
   <w:style w:type="paragraph" w:default="1" w:styleId="Normal">
     <w:name w:val="Normal"/>
     <w:qFormat/>
+  </w:style>
+  <w:style w:type="paragraph" w:styleId="Ttulo1">
+    <w:name w:val="heading 1"/>
+    <w:basedOn w:val="Normal"/>
+    <w:next w:val="Normal"/>
+    <w:link w:val="Ttulo1Char"/>
+    <w:uiPriority w:val="9"/>
+    <w:qFormat/>
+    <w:rsid w:val="003F2468"/>
+    <w:pPr>
+      <w:keepNext/>
+      <w:keepLines/>
+      <w:spacing w:before="240" w:after="0"/>
+      <w:outlineLvl w:val="0"/>
+    </w:pPr>
+    <w:rPr>
+      <w:rFonts w:asciiTheme="majorHAnsi" w:eastAsiaTheme="majorEastAsia" w:hAnsiTheme="majorHAnsi" w:cstheme="majorBidi"/>
+      <w:color w:val="2F5496" w:themeColor="accent1" w:themeShade="BF"/>
+      <w:sz w:val="32"/>
+      <w:szCs w:val="32"/>
+    </w:rPr>
+  </w:style>
+  <w:style w:type="paragraph" w:styleId="Ttulo3">
+    <w:name w:val="heading 3"/>
+    <w:basedOn w:val="Normal"/>
+    <w:link w:val="Ttulo3Char"/>
+    <w:uiPriority w:val="9"/>
+    <w:qFormat/>
+    <w:rsid w:val="003F2468"/>
+    <w:pPr>
+      <w:spacing w:before="100" w:beforeAutospacing="1" w:after="100" w:afterAutospacing="1" w:line="240" w:lineRule="auto"/>
+      <w:outlineLvl w:val="2"/>
+    </w:pPr>
+    <w:rPr>
+      <w:rFonts w:ascii="Times New Roman" w:eastAsia="Times New Roman" w:hAnsi="Times New Roman" w:cs="Times New Roman"/>
+      <w:b/>
+      <w:bCs/>
+      <w:sz w:val="27"/>
+      <w:szCs w:val="27"/>
+      <w:lang w:eastAsia="pt-BR"/>
+    </w:rPr>
   </w:style>
   <w:style w:type="character" w:default="1" w:styleId="Fontepargpadro">
     <w:name w:val="Default Paragraph Font"/>
@@ -943,6 +2125,84 @@
     <w:rPr>
       <w:b/>
       <w:bCs/>
+    </w:rPr>
+  </w:style>
+  <w:style w:type="character" w:customStyle="1" w:styleId="Ttulo3Char">
+    <w:name w:val="Título 3 Char"/>
+    <w:basedOn w:val="Fontepargpadro"/>
+    <w:link w:val="Ttulo3"/>
+    <w:uiPriority w:val="9"/>
+    <w:rsid w:val="003F2468"/>
+    <w:rPr>
+      <w:rFonts w:ascii="Times New Roman" w:eastAsia="Times New Roman" w:hAnsi="Times New Roman" w:cs="Times New Roman"/>
+      <w:b/>
+      <w:bCs/>
+      <w:sz w:val="27"/>
+      <w:szCs w:val="27"/>
+      <w:lang w:eastAsia="pt-BR"/>
+    </w:rPr>
+  </w:style>
+  <w:style w:type="paragraph" w:styleId="PargrafodaLista">
+    <w:name w:val="List Paragraph"/>
+    <w:basedOn w:val="Normal"/>
+    <w:uiPriority w:val="34"/>
+    <w:qFormat/>
+    <w:rsid w:val="003F2468"/>
+    <w:pPr>
+      <w:ind w:left="720"/>
+      <w:contextualSpacing/>
+    </w:pPr>
+  </w:style>
+  <w:style w:type="character" w:customStyle="1" w:styleId="Ttulo1Char">
+    <w:name w:val="Título 1 Char"/>
+    <w:basedOn w:val="Fontepargpadro"/>
+    <w:link w:val="Ttulo1"/>
+    <w:uiPriority w:val="9"/>
+    <w:rsid w:val="003F2468"/>
+    <w:rPr>
+      <w:rFonts w:asciiTheme="majorHAnsi" w:eastAsiaTheme="majorEastAsia" w:hAnsiTheme="majorHAnsi" w:cstheme="majorBidi"/>
+      <w:color w:val="2F5496" w:themeColor="accent1" w:themeShade="BF"/>
+      <w:sz w:val="32"/>
+      <w:szCs w:val="32"/>
+    </w:rPr>
+  </w:style>
+  <w:style w:type="paragraph" w:styleId="CabealhodoSumrio">
+    <w:name w:val="TOC Heading"/>
+    <w:basedOn w:val="Ttulo1"/>
+    <w:next w:val="Normal"/>
+    <w:uiPriority w:val="39"/>
+    <w:unhideWhenUsed/>
+    <w:qFormat/>
+    <w:rsid w:val="003F2468"/>
+    <w:pPr>
+      <w:outlineLvl w:val="9"/>
+    </w:pPr>
+    <w:rPr>
+      <w:lang w:eastAsia="pt-BR"/>
+    </w:rPr>
+  </w:style>
+  <w:style w:type="paragraph" w:styleId="Sumrio3">
+    <w:name w:val="toc 3"/>
+    <w:basedOn w:val="Normal"/>
+    <w:next w:val="Normal"/>
+    <w:autoRedefine/>
+    <w:uiPriority w:val="39"/>
+    <w:unhideWhenUsed/>
+    <w:rsid w:val="003F2468"/>
+    <w:pPr>
+      <w:spacing w:after="100"/>
+      <w:ind w:left="440"/>
+    </w:pPr>
+  </w:style>
+  <w:style w:type="character" w:styleId="Hyperlink">
+    <w:name w:val="Hyperlink"/>
+    <w:basedOn w:val="Fontepargpadro"/>
+    <w:uiPriority w:val="99"/>
+    <w:unhideWhenUsed/>
+    <w:rsid w:val="003F2468"/>
+    <w:rPr>
+      <w:color w:val="0563C1" w:themeColor="hyperlink"/>
+      <w:u w:val="single"/>
     </w:rPr>
   </w:style>
 </w:styles>

</xml_diff>